<commit_message>
Add GCSE style circuit question paper and mark scheme
</commit_message>
<xml_diff>
--- a/electricity-magnetism-revision/answers.docx
+++ b/electricity-magnetism-revision/answers.docx
@@ -15,12 +15,12 @@
         <w:pStyle w:val="Subtitle"/>
       </w:pPr>
       <w:r>
-        <w:t>Marking guide for the 48 mark practice booklet</w:t>
+        <w:t>Mark scheme for the 60 mark GCSE style practice paper</w:t>
       </w:r>
     </w:p>
     <w:p>
       <w:r>
-        <w:t>Use these answers to check the physics and award the mark shown after each point. Accept scientifically equivalent wording and correct alternative methods with working. A final number without working may not earn every calculation mark.</w:t>
+        <w:t>Award the marks shown for each point. Accept equivalent scientific wording and correct alternative methods. In calculation questions, give the method marks when the stated working is correct even if a later arithmetic error occurs.</w:t>
       </w:r>
     </w:p>
     <w:p>
@@ -28,121 +28,49 @@
         <w:pStyle w:val="Heading1"/>
       </w:pPr>
       <w:r>
-        <w:t>Static electricity</w:t>
+        <w:t>Question 1  Static electricity   [8 marks]</w:t>
       </w:r>
     </w:p>
     <w:p>
       <w:pPr>
-        <w:pStyle w:val="Heading2"/>
-        <w:keepNext/>
+        <w:ind w:left="198" w:hanging="198"/>
       </w:pPr>
       <w:r>
-        <w:t>Question 1  3 marks</w:t>
+        <w:rPr>
+          <w:b/>
+        </w:rPr>
+        <w:t xml:space="preserve">(a)  </w:t>
       </w:r>
-    </w:p>
-    <w:p>
       <w:r>
-        <w:t>A neutral plastic rod is rubbed with a cloth. Electrons move from the cloth to the rod. State the charge on each and explain why. [3]</w:t>
+        <w:t>Electrons move from the wool cloth to the plastic rod (1); the cloth is left positively charged (1). [2]</w:t>
       </w:r>
     </w:p>
     <w:p>
       <w:pPr>
-        <w:ind w:left="255"/>
+        <w:ind w:left="198" w:hanging="198"/>
       </w:pPr>
       <w:r>
-        <w:t>The rod gains electrons and becomes negative (1)</w:t>
+        <w:rPr>
+          <w:b/>
+        </w:rPr>
+        <w:t xml:space="preserve">(b)  </w:t>
+      </w:r>
+      <w:r>
+        <w:t>The negative rod repels electrons in the near side of the neutral paper (1); the near side becomes relatively positive while the far side becomes relatively negative (1); the attraction between opposite charges at the nearer side is stronger than the repulsion at the farther side, giving a net attraction (1). [3]</w:t>
       </w:r>
     </w:p>
     <w:p>
       <w:pPr>
-        <w:ind w:left="255"/>
+        <w:ind w:left="198" w:hanging="198"/>
       </w:pPr>
       <w:r>
-        <w:t>The cloth loses electrons and becomes positive (1)</w:t>
+        <w:rPr>
+          <w:b/>
+        </w:rPr>
+        <w:t xml:space="preserve">(c)  </w:t>
       </w:r>
-    </w:p>
-    <w:p>
-      <w:pPr>
-        <w:ind w:left="255"/>
-      </w:pPr>
       <w:r>
-        <w:t>Protons remain in the nuclei (1).</w:t>
-      </w:r>
-    </w:p>
-    <w:p>
-      <w:pPr>
-        <w:pStyle w:val="Heading2"/>
-        <w:keepNext/>
-      </w:pPr>
-      <w:r>
-        <w:t>Question 2  4 marks</w:t>
-      </w:r>
-    </w:p>
-    <w:p>
-      <w:r>
-        <w:t>A charged rod attracts small neutral pieces of paper. Explain this observation using induced charge and distance. [4]</w:t>
-      </w:r>
-    </w:p>
-    <w:p>
-      <w:pPr>
-        <w:ind w:left="255"/>
-      </w:pPr>
-      <w:r>
-        <w:t>Charge is redistributed or polarised in the paper (1)</w:t>
-      </w:r>
-    </w:p>
-    <w:p>
-      <w:pPr>
-        <w:ind w:left="255"/>
-      </w:pPr>
-      <w:r>
-        <w:t>The nearer side has opposite charge to the rod (1)</w:t>
-      </w:r>
-    </w:p>
-    <w:p>
-      <w:pPr>
-        <w:ind w:left="255"/>
-      </w:pPr>
-      <w:r>
-        <w:t>The farther side has like charge (1)</w:t>
-      </w:r>
-    </w:p>
-    <w:p>
-      <w:pPr>
-        <w:ind w:left="255"/>
-      </w:pPr>
-      <w:r>
-        <w:t>The attraction is stronger at the smaller separation than the repulsion, giving a net force toward the rod (1).</w:t>
-      </w:r>
-    </w:p>
-    <w:p>
-      <w:pPr>
-        <w:pStyle w:val="Heading2"/>
-        <w:keepNext/>
-      </w:pPr>
-      <w:r>
-        <w:t>Question 3  4 marks</w:t>
-      </w:r>
-    </w:p>
-    <w:p>
-      <w:r>
-        <w:t>Explain how a cloud and ground can produce a lightning strike. Include charge separation, induced charge and the role of air. [4]</w:t>
-      </w:r>
-    </w:p>
-    <w:p>
-      <w:pPr>
-        <w:ind w:left="255"/>
-      </w:pPr>
-      <w:r>
-        <w:t>Charge separates in the cloud (1), inducing opposite charge on the ground (1)</w:t>
-      </w:r>
-    </w:p>
-    <w:p>
-      <w:pPr>
-        <w:ind w:left="255"/>
-      </w:pPr>
-      <w:r>
-        <w:t>The large potential difference produces a strong electric field (1), which ionises the air so charge can flow as a spark (1).</w:t>
+        <w:t>Charge separation occurs in the cloud (1); the charged cloud induces opposite charge at the ground or creates a large potential difference (1); when the electric field is strong enough the air ionises and charge flows through the conducting path as a discharge (1). [3]</w:t>
       </w:r>
     </w:p>
     <w:p>
@@ -150,97 +78,63 @@
         <w:pStyle w:val="Heading1"/>
       </w:pPr>
       <w:r>
-        <w:t>DC circuits</w:t>
+        <w:t>Question 2  Meters and a lamp   [10 marks]</w:t>
       </w:r>
     </w:p>
     <w:p>
       <w:pPr>
-        <w:pStyle w:val="Heading2"/>
-        <w:keepNext/>
+        <w:ind w:left="198" w:hanging="198"/>
       </w:pPr>
       <w:r>
-        <w:t>Question 4  4 marks</w:t>
+        <w:rPr>
+          <w:b/>
+        </w:rPr>
+        <w:t xml:space="preserve">(a)  </w:t>
       </w:r>
-    </w:p>
-    <w:p>
       <w:r>
-        <w:t>A 9.0 V supply is connected across a fixed 3.0 Ω resistor. Calculate the current and the power transferred. Show working. [4]</w:t>
+        <w:t>X is an ammeter (1), placed in series so the same current passes through it and the lamp (1). Y is a voltmeter (1), connected in parallel across the lamp to measure its potential difference (1). [4]</w:t>
       </w:r>
     </w:p>
     <w:p>
       <w:pPr>
-        <w:ind w:left="255"/>
+        <w:ind w:left="198" w:hanging="198"/>
       </w:pPr>
       <w:r>
-        <w:t>I = V/R = 9.0/3.0 = 3.0 A (2)</w:t>
+        <w:rPr>
+          <w:b/>
+        </w:rPr>
+        <w:t xml:space="preserve">(b)  </w:t>
+      </w:r>
+      <w:r>
+        <w:t>R = V ÷ I (1) = 9 ÷ 0.30 (1) = 30 Ω (1). [3]</w:t>
       </w:r>
     </w:p>
     <w:p>
       <w:pPr>
-        <w:ind w:left="255"/>
+        <w:ind w:left="198" w:hanging="198"/>
       </w:pPr>
       <w:r>
-        <w:t>P = VI = 9.0 × 3.0 = 27 W (2).</w:t>
+        <w:rPr>
+          <w:b/>
+        </w:rPr>
+        <w:t xml:space="preserve">(c)  </w:t>
+      </w:r>
+      <w:r>
+        <w:t>P = VI (1) = 9 × 0.30 = 2.7 W (1). [2]</w:t>
       </w:r>
     </w:p>
     <w:p>
       <w:pPr>
-        <w:pStyle w:val="Heading2"/>
-        <w:keepNext/>
+        <w:ind w:left="198" w:hanging="198"/>
       </w:pPr>
       <w:r>
-        <w:t>Question 5  4 marks</w:t>
+        <w:rPr>
+          <w:b/>
+        </w:rPr>
+        <w:t xml:space="preserve">(d)  </w:t>
       </w:r>
-    </w:p>
-    <w:p>
       <w:r>
-        <w:t>Describe how to connect an ammeter and voltmeter to measure the current through and potential difference across a lamp. Explain the resistance of each meter. [4]</w:t>
-      </w:r>
-    </w:p>
-    <w:p>
-      <w:pPr>
-        <w:ind w:left="255"/>
-      </w:pPr>
-      <w:r>
-        <w:t>Ammeter in series (1) with very low resistance (1)</w:t>
-      </w:r>
-    </w:p>
-    <w:p>
-      <w:pPr>
-        <w:ind w:left="255"/>
-      </w:pPr>
-      <w:r>
-        <w:t>Voltmeter in parallel across the lamp (1) with very high resistance (1).</w:t>
-      </w:r>
-    </w:p>
-    <w:p>
-      <w:pPr>
-        <w:pStyle w:val="Heading2"/>
-        <w:keepNext/>
-      </w:pPr>
-      <w:r>
-        <w:t>Question 6  4 marks</w:t>
-      </w:r>
-    </w:p>
-    <w:p>
-      <w:r>
-        <w:t>A student graphs voltage V on the vertical axis against current I on the horizontal axis for a fixed resistor. The points (0.20 A, 1.0 V) and (0.60 A, 3.0 V) lie on a straight line. Find the resistance and explain the line’s shape. [4]</w:t>
-      </w:r>
-    </w:p>
-    <w:p>
-      <w:pPr>
-        <w:ind w:left="255"/>
-      </w:pPr>
-      <w:r>
-        <w:t>Gradient ΔV/ΔI = (3.0−1.0)/(0.60−0.20) (1) = 5.0 Ω (1)</w:t>
-      </w:r>
-    </w:p>
-    <w:p>
-      <w:pPr>
-        <w:ind w:left="255"/>
-      </w:pPr>
-      <w:r>
-        <w:t>V is directly proportional to I (1) if temperature and resistance remain constant (1).</w:t>
+        <w:t>Each coulomb transfers 9 J of energy in the lamp. [1]</w:t>
       </w:r>
     </w:p>
     <w:p>
@@ -248,107 +142,77 @@
         <w:pStyle w:val="Heading1"/>
       </w:pPr>
       <w:r>
-        <w:t>Series and parallel circuits</w:t>
+        <w:t>Question 3  Lamps in series   [10 marks]</w:t>
       </w:r>
     </w:p>
     <w:p>
       <w:pPr>
-        <w:pStyle w:val="Heading2"/>
-        <w:keepNext/>
+        <w:ind w:left="198" w:hanging="198"/>
       </w:pPr>
       <w:r>
-        <w:t>Question 7  5 marks</w:t>
+        <w:rPr>
+          <w:b/>
+        </w:rPr>
+        <w:t xml:space="preserve">(a)  </w:t>
       </w:r>
-    </w:p>
-    <w:p>
       <w:r>
-        <w:t>A 12 V supply is connected to 2 Ω and 4 Ω resistors in series. Calculate total resistance, current and voltage across each resistor. [5]</w:t>
+        <w:t>Rtotal = R A + R B (1) = 4 + 8 = 12 Ω (1). [2]</w:t>
       </w:r>
     </w:p>
     <w:p>
       <w:pPr>
-        <w:ind w:left="255"/>
+        <w:ind w:left="198" w:hanging="198"/>
       </w:pPr>
       <w:r>
-        <w:t>Rtotal = 2 + 4 = 6 Ω (1)</w:t>
+        <w:rPr>
+          <w:b/>
+        </w:rPr>
+        <w:t xml:space="preserve">(b)  </w:t>
+      </w:r>
+      <w:r>
+        <w:t>I = V ÷ Rtotal (1) = 12 ÷ 12 = 1.0 A through A and B (1). [2]</w:t>
       </w:r>
     </w:p>
     <w:p>
       <w:pPr>
-        <w:ind w:left="255"/>
+        <w:ind w:left="198" w:hanging="198"/>
       </w:pPr>
       <w:r>
-        <w:t>I = 12/6 = 2 A (1)</w:t>
+        <w:rPr>
+          <w:b/>
+        </w:rPr>
+        <w:t xml:space="preserve">(c)  </w:t>
+      </w:r>
+      <w:r>
+        <w:t>V B = I × R B (1) = 1.0 × 8 = 8 V (1). [2]</w:t>
       </w:r>
     </w:p>
     <w:p>
       <w:pPr>
-        <w:ind w:left="255"/>
+        <w:ind w:left="198" w:hanging="198"/>
       </w:pPr>
       <w:r>
-        <w:t>V2Ω = 2×2 = 4 V (1)</w:t>
+        <w:rPr>
+          <w:b/>
+        </w:rPr>
+        <w:t xml:space="preserve">(d)  </w:t>
+      </w:r>
+      <w:r>
+        <w:t>V A = 4 V, from IR or 12 − 8. [1]</w:t>
       </w:r>
     </w:p>
     <w:p>
       <w:pPr>
-        <w:ind w:left="255"/>
+        <w:ind w:left="198" w:hanging="198"/>
       </w:pPr>
       <w:r>
-        <w:t>V4Ω = 2×4 = 8 V (1)</w:t>
+        <w:rPr>
+          <w:b/>
+        </w:rPr>
+        <w:t xml:space="preserve">(e)  </w:t>
       </w:r>
-    </w:p>
-    <w:p>
-      <w:pPr>
-        <w:ind w:left="255"/>
-      </w:pPr>
       <w:r>
-        <w:t>The voltage drops add to 12 V (1).</w:t>
-      </w:r>
-    </w:p>
-    <w:p>
-      <w:pPr>
-        <w:pStyle w:val="Heading2"/>
-        <w:keepNext/>
-      </w:pPr>
-      <w:r>
-        <w:t>Question 8  4 marks</w:t>
-      </w:r>
-    </w:p>
-    <w:p>
-      <w:r>
-        <w:t>Two parallel branches contain resistors of 6 Ω and 3 Ω. Each branch is directly across an ideal 6 V supply. Find each branch current and the total supply current. [4]</w:t>
-      </w:r>
-    </w:p>
-    <w:p>
-      <w:pPr>
-        <w:ind w:left="255"/>
-      </w:pPr>
-      <w:r>
-        <w:t>Each branch is at 6 V (1)</w:t>
-      </w:r>
-    </w:p>
-    <w:p>
-      <w:pPr>
-        <w:ind w:left="255"/>
-      </w:pPr>
-      <w:r>
-        <w:t>I6Ω = 6/6 = 1 A (1)</w:t>
-      </w:r>
-    </w:p>
-    <w:p>
-      <w:pPr>
-        <w:ind w:left="255"/>
-      </w:pPr>
-      <w:r>
-        <w:t>I3Ω = 6/3 = 2 A (1)</w:t>
-      </w:r>
-    </w:p>
-    <w:p>
-      <w:pPr>
-        <w:ind w:left="255"/>
-      </w:pPr>
-      <w:r>
-        <w:t>Total = 3 A (1).</w:t>
+        <w:t>Total resistance increases (1), so current in the series circuit decreases (1), and the original lamps become dimmer because each transfers less power (1). [3]</w:t>
       </w:r>
     </w:p>
     <w:p>
@@ -356,83 +220,91 @@
         <w:pStyle w:val="Heading1"/>
       </w:pPr>
       <w:r>
-        <w:t>Magnetic fields</w:t>
+        <w:t>Question 4  Lamps in parallel   [10 marks]</w:t>
       </w:r>
     </w:p>
     <w:p>
       <w:pPr>
-        <w:pStyle w:val="Heading2"/>
-        <w:keepNext/>
+        <w:ind w:left="198" w:hanging="198"/>
       </w:pPr>
       <w:r>
-        <w:t>Question 9  4 marks</w:t>
+        <w:rPr>
+          <w:b/>
+        </w:rPr>
+        <w:t xml:space="preserve">(a)  </w:t>
       </w:r>
-    </w:p>
-    <w:p>
       <w:r>
-        <w:t>An iron nail is attracted by both ends of a bar magnet. Explain why this does not prove the nail is a permanent magnet. State a test that would show the nail is a magnet. [4]</w:t>
+        <w:t>A has 6 V (1) and B has 6 V (1); each branch is across the battery. [2]</w:t>
       </w:r>
     </w:p>
     <w:p>
       <w:pPr>
-        <w:ind w:left="255"/>
+        <w:ind w:left="198" w:hanging="198"/>
       </w:pPr>
       <w:r>
-        <w:t>The field induces magnetism in the nail (1)</w:t>
+        <w:rPr>
+          <w:b/>
+        </w:rPr>
+        <w:t xml:space="preserve">(b)  </w:t>
+      </w:r>
+      <w:r>
+        <w:t>I A = V ÷ R A (1) = 6 ÷ 6 = 1 A (1). [2]</w:t>
       </w:r>
     </w:p>
     <w:p>
       <w:pPr>
-        <w:ind w:left="255"/>
+        <w:ind w:left="198" w:hanging="198"/>
       </w:pPr>
       <w:r>
-        <w:t>Its near end becomes the opposite pole, so either end attracts (1)</w:t>
+        <w:rPr>
+          <w:b/>
+        </w:rPr>
+        <w:t xml:space="preserve">(c)  </w:t>
+      </w:r>
+      <w:r>
+        <w:t>I B = V ÷ R B (1) = 6 ÷ 3 = 2 A (1). [2]</w:t>
       </w:r>
     </w:p>
     <w:p>
       <w:pPr>
-        <w:ind w:left="255"/>
+        <w:ind w:left="198" w:hanging="198"/>
       </w:pPr>
       <w:r>
-        <w:t>Bring a known pole of a magnet toward both ends of the nail (1); repulsion at one end would show it has a fixed pole and is magnetised (1).</w:t>
+        <w:rPr>
+          <w:b/>
+        </w:rPr>
+        <w:t xml:space="preserve">(d)  </w:t>
+      </w:r>
+      <w:r>
+        <w:t>Itotal = 1 + 2 = 3 A. [1]</w:t>
       </w:r>
     </w:p>
     <w:p>
       <w:pPr>
-        <w:pStyle w:val="Heading2"/>
-        <w:keepNext/>
+        <w:ind w:left="198" w:hanging="198"/>
       </w:pPr>
       <w:r>
-        <w:t>Question 10  3 marks</w:t>
+        <w:rPr>
+          <w:b/>
+        </w:rPr>
+        <w:t xml:space="preserve">(e)  </w:t>
       </w:r>
-    </w:p>
-    <w:p>
       <w:r>
-        <w:t>Describe the pattern and direction of field lines around a bar magnet. Explain how the diagram shows field strength. [3]</w:t>
+        <w:t>P B = VI (1) = 6 × 2 = 12 W (1). Accept V²/R. [2]</w:t>
       </w:r>
     </w:p>
     <w:p>
       <w:pPr>
-        <w:ind w:left="255"/>
+        <w:ind w:left="198" w:hanging="198"/>
       </w:pPr>
       <w:r>
-        <w:t>Lines emerge from north and enter south outside the magnet (1)</w:t>
+        <w:rPr>
+          <w:b/>
+        </w:rPr>
+        <w:t xml:space="preserve">(f)  </w:t>
       </w:r>
-    </w:p>
-    <w:p>
-      <w:pPr>
-        <w:ind w:left="255"/>
-      </w:pPr>
       <w:r>
-        <w:t>Lines curve around and do not cross (1)</w:t>
-      </w:r>
-    </w:p>
-    <w:p>
-      <w:pPr>
-        <w:ind w:left="255"/>
-      </w:pPr>
-      <w:r>
-        <w:t>Closer spacing near poles shows a stronger field (1).</w:t>
+        <w:t>The B branch is open, so only A draws current: 1 A. [1]</w:t>
       </w:r>
     </w:p>
     <w:p>
@@ -440,91 +312,77 @@
         <w:pStyle w:val="Heading1"/>
       </w:pPr>
       <w:r>
-        <w:t>Electromagnetism</w:t>
+        <w:t>Question 5  A mixed circuit   [10 marks]</w:t>
       </w:r>
     </w:p>
     <w:p>
       <w:pPr>
-        <w:pStyle w:val="Heading2"/>
-        <w:keepNext/>
+        <w:ind w:left="198" w:hanging="198"/>
       </w:pPr>
       <w:r>
-        <w:t>Question 11  4 marks</w:t>
+        <w:rPr>
+          <w:b/>
+        </w:rPr>
+        <w:t xml:space="preserve">(a)  </w:t>
       </w:r>
-    </w:p>
-    <w:p>
       <w:r>
-        <w:t>State the magnetic field shape around a straight current carrying wire and explain how to determine its direction. What happens farther from the wire? [4]</w:t>
+        <w:t>Vseries = IR (1) = 2.0 × 2 = 4 V (1). [2]</w:t>
       </w:r>
     </w:p>
     <w:p>
       <w:pPr>
-        <w:ind w:left="255"/>
+        <w:ind w:left="198" w:hanging="198"/>
       </w:pPr>
       <w:r>
-        <w:t>Concentric circles centred on the wire (1)</w:t>
+        <w:rPr>
+          <w:b/>
+        </w:rPr>
+        <w:t xml:space="preserve">(b)  </w:t>
+      </w:r>
+      <w:r>
+        <w:t>Vparallel = 12 − 4 (1) = 8 V (1). [2]</w:t>
       </w:r>
     </w:p>
     <w:p>
       <w:pPr>
-        <w:ind w:left="255"/>
+        <w:ind w:left="198" w:hanging="198"/>
       </w:pPr>
       <w:r>
-        <w:t>Right thumb in conventional current direction (1), curled fingers give field direction (1)</w:t>
+        <w:rPr>
+          <w:b/>
+        </w:rPr>
+        <w:t xml:space="preserve">(c)  </w:t>
+      </w:r>
+      <w:r>
+        <w:t>Ibranch = Vparallel ÷ Rbranch (1) = 8 ÷ 8 = 1 A in each branch (1). [2]</w:t>
       </w:r>
     </w:p>
     <w:p>
       <w:pPr>
-        <w:ind w:left="255"/>
+        <w:ind w:left="198" w:hanging="198"/>
       </w:pPr>
       <w:r>
-        <w:t>Field strength decreases farther from the wire (1).</w:t>
+        <w:rPr>
+          <w:b/>
+        </w:rPr>
+        <w:t xml:space="preserve">(d)  </w:t>
+      </w:r>
+      <w:r>
+        <w:t>At the junction 1 + 1 = 2 A (1). Around either complete loop 4 + 8 = 12 V (1). [2]</w:t>
       </w:r>
     </w:p>
     <w:p>
       <w:pPr>
-        <w:pStyle w:val="Heading2"/>
-        <w:keepNext/>
+        <w:ind w:left="198" w:hanging="198"/>
       </w:pPr>
       <w:r>
-        <w:t>Question 12  5 marks</w:t>
+        <w:rPr>
+          <w:b/>
+        </w:rPr>
+        <w:t xml:space="preserve">(e)  </w:t>
       </w:r>
-    </w:p>
-    <w:p>
       <w:r>
-        <w:t>A door lock uses a solenoid with an iron core. Explain how switching on the current releases the latch and give two ways to increase the pull. [5]</w:t>
-      </w:r>
-    </w:p>
-    <w:p>
-      <w:pPr>
-        <w:ind w:left="255"/>
-      </w:pPr>
-      <w:r>
-        <w:t>Current produces a magnetic field around the coil (1)</w:t>
-      </w:r>
-    </w:p>
-    <w:p>
-      <w:pPr>
-        <w:ind w:left="255"/>
-      </w:pPr>
-      <w:r>
-        <w:t>The iron core becomes magnetised and strengthens the field (1)</w:t>
-      </w:r>
-    </w:p>
-    <w:p>
-      <w:pPr>
-        <w:ind w:left="255"/>
-      </w:pPr>
-      <w:r>
-        <w:t>Magnetic attraction moves the iron armature/latch (1)</w:t>
-      </w:r>
-    </w:p>
-    <w:p>
-      <w:pPr>
-        <w:ind w:left="255"/>
-      </w:pPr>
-      <w:r>
-        <w:t>Increase current (1) and increase turns per unit length (1).</w:t>
+        <w:t>New total R = 2 + 8 = 10 Ω (1); I = 12 ÷ 10 = 1.2 A (1). [2]</w:t>
       </w:r>
     </w:p>
     <w:p>
@@ -532,13 +390,139 @@
         <w:pStyle w:val="Heading1"/>
       </w:pPr>
       <w:r>
-        <w:t>Total  48 marks</w:t>
+        <w:t>Question 6  Magnetic fields and a door lock   [12 marks]</w:t>
+      </w:r>
+    </w:p>
+    <w:p>
+      <w:pPr>
+        <w:ind w:left="198" w:hanging="198"/>
+      </w:pPr>
+      <w:r>
+        <w:rPr>
+          <w:b/>
+        </w:rPr>
+        <w:t xml:space="preserve">(a)  </w:t>
+      </w:r>
+      <w:r>
+        <w:t>The end nearest the bar magnet’s S pole becomes N (1). Opposite poles attract (1). [2]</w:t>
+      </w:r>
+    </w:p>
+    <w:p>
+      <w:pPr>
+        <w:ind w:left="198" w:hanging="198"/>
+      </w:pPr>
+      <w:r>
+        <w:rPr>
+          <w:b/>
+        </w:rPr>
+        <w:t xml:space="preserve">(b)  </w:t>
+      </w:r>
+      <w:r>
+        <w:t>Award 1 for two curved external field lines emerging from N and entering S; 1 for arrows N → S. Do not award a straight line through the magnet as an external field line. [2]</w:t>
+      </w:r>
+    </w:p>
+    <w:p>
+      <w:pPr>
+        <w:ind w:left="198" w:hanging="198"/>
+      </w:pPr>
+      <w:r>
+        <w:rPr>
+          <w:b/>
+        </w:rPr>
+        <w:t xml:space="preserve">(c)  </w:t>
+      </w:r>
+      <w:r>
+        <w:t>One approximately circular field line centred on the dot, with an anticlockwise arrow. [1]</w:t>
+      </w:r>
+    </w:p>
+    <w:p>
+      <w:pPr>
+        <w:ind w:left="198" w:hanging="198"/>
+      </w:pPr>
+      <w:r>
+        <w:rPr>
+          <w:b/>
+        </w:rPr>
+        <w:t xml:space="preserve">(d)  </w:t>
+      </w:r>
+      <w:r>
+        <w:t>North pole. [1]</w:t>
+      </w:r>
+    </w:p>
+    <w:p>
+      <w:pPr>
+        <w:jc w:val="center"/>
+      </w:pPr>
+      <w:r>
+        <w:drawing>
+          <wp:inline xmlns:a="http://schemas.openxmlformats.org/drawingml/2006/main" xmlns:pic="http://schemas.openxmlformats.org/drawingml/2006/picture">
+            <wp:extent cx="5112000" cy="1736151"/>
+            <wp:docPr id="1" name="Picture 1"/>
+            <wp:cNvGraphicFramePr>
+              <a:graphicFrameLocks noChangeAspect="1"/>
+            </wp:cNvGraphicFramePr>
+            <a:graphic>
+              <a:graphicData uri="http://schemas.openxmlformats.org/drawingml/2006/picture">
+                <pic:pic>
+                  <pic:nvPicPr>
+                    <pic:cNvPr id="0" name="magnet_answer.png"/>
+                    <pic:cNvPicPr/>
+                  </pic:nvPicPr>
+                  <pic:blipFill>
+                    <a:blip r:embed="rId10"/>
+                    <a:stretch>
+                      <a:fillRect/>
+                    </a:stretch>
+                  </pic:blipFill>
+                  <pic:spPr>
+                    <a:xfrm>
+                      <a:off x="0" y="0"/>
+                      <a:ext cx="5112000" cy="1736151"/>
+                    </a:xfrm>
+                    <a:prstGeom prst="rect"/>
+                  </pic:spPr>
+                </pic:pic>
+              </a:graphicData>
+            </a:graphic>
+          </wp:inline>
+        </w:drawing>
+      </w:r>
+    </w:p>
+    <w:p>
+      <w:pPr>
+        <w:pStyle w:val="Heading2"/>
+      </w:pPr>
+      <w:r>
+        <w:t>Question 6 e  Extended response   [6 marks]</w:t>
+      </w:r>
+    </w:p>
+    <w:p>
+      <w:r>
+        <w:t>Indicative content: Closing the switch allows current through the coil; the current produces a magnetic field and magnetises the soft iron core; the stronger field attracts the iron armature and moves the latch; opening the switch stops the current, the soft iron loses most magnetisation, and the return spring moves the armature back. More turns on the coil and a larger current each increase the field strength. Equivalent correct descriptions of the locking direction are acceptable.</w:t>
+      </w:r>
+    </w:p>
+    <w:p>
+      <w:r>
+        <w:t>Level 3  5–6 marks: Clear linked account of on and off operation, armature movement and core, with two valid strengthening methods. Level 2  3–4 marks: Mostly correct account of operation with some causal links and at least one relevant strengthening method. Level 1  1–2 marks: Isolated correct statements about the coil, core, attraction or switching. Level 0  0 marks: No relevant correct content.</w:t>
+      </w:r>
+    </w:p>
+    <w:p>
+      <w:r>
+        <w:t>For 6 marks, include all key stages with clear links. For 5 marks, allow one minor omission. Select the level first, then the mark within that level. [6]</w:t>
+      </w:r>
+    </w:p>
+    <w:p>
+      <w:pPr>
+        <w:pStyle w:val="Heading1"/>
+      </w:pPr>
+      <w:r>
+        <w:t>Total 60 marks</w:t>
       </w:r>
     </w:p>
     <w:sectPr>
       <w:footerReference w:type="default" r:id="rId9"/>
       <w:pgSz w:w="11906" w:h="16838"/>
-      <w:pgMar w:top="1191" w:right="1247" w:bottom="1020" w:left="1247" w:header="720" w:footer="720" w:gutter="0"/>
+      <w:pgMar w:top="964" w:right="1219" w:bottom="879" w:left="1219" w:header="720" w:footer="720" w:gutter="0"/>
       <w:cols w:space="720"/>
       <w:docGrid w:linePitch="360"/>
     </w:sectPr>
@@ -554,7 +538,7 @@
       <w:jc w:val="right"/>
     </w:pPr>
     <w:r>
-      <w:t xml:space="preserve">St Peter’s School  •  Year 11 Physics  •  </w:t>
+      <w:t xml:space="preserve">Year 11 Physics  •  </w:t>
     </w:r>
     <w:fldSimple w:instr="PAGE"/>
   </w:p>
@@ -925,11 +909,11 @@
     <w:qFormat/>
     <w:rsid w:val="00FC693F"/>
     <w:pPr>
-      <w:spacing w:after="120" w:line="283" w:lineRule="auto"/>
+      <w:spacing w:after="80" w:line="264" w:lineRule="auto"/>
     </w:pPr>
     <w:rPr>
       <w:rFonts w:ascii="Aptos" w:hAnsi="Aptos"/>
-      <w:color w:val="1B2939"/>
+      <w:color w:val="000000"/>
       <w:sz w:val="21"/>
     </w:rPr>
   </w:style>
@@ -988,7 +972,7 @@
     <w:pPr>
       <w:keepNext/>
       <w:keepLines/>
-      <w:spacing w:before="320" w:after="140"/>
+      <w:spacing w:before="180" w:after="100"/>
       <w:outlineLvl w:val="0"/>
     </w:pPr>
     <w:rPr>
@@ -996,7 +980,7 @@
       <w:b/>
       <w:bCs/>
       <w:color w:val="000000"/>
-      <w:sz w:val="28"/>
+      <w:sz w:val="26"/>
       <w:szCs w:val="28"/>
     </w:rPr>
   </w:style>
@@ -1012,7 +996,7 @@
     <w:pPr>
       <w:keepNext/>
       <w:keepLines/>
-      <w:spacing w:before="320" w:after="140"/>
+      <w:spacing w:before="180" w:after="100"/>
       <w:outlineLvl w:val="1"/>
     </w:pPr>
     <w:rPr>
@@ -1274,16 +1258,16 @@
     <w:qFormat/>
     <w:rsid w:val="00FC693F"/>
     <w:pPr>
-      <w:spacing w:after="140" w:line="240" w:lineRule="auto" w:before="0"/>
+      <w:spacing w:after="100" w:line="240" w:lineRule="auto" w:before="180"/>
       <w:contextualSpacing/>
     </w:pPr>
     <w:rPr>
-      <w:rFonts w:asciiTheme="majorHAnsi" w:eastAsiaTheme="majorEastAsia" w:hAnsiTheme="majorHAnsi" w:cstheme="majorBidi" w:ascii="Aptos Display" w:hAnsi="Aptos Display"/>
+      <w:rFonts w:asciiTheme="majorHAnsi" w:eastAsiaTheme="majorEastAsia" w:hAnsiTheme="majorHAnsi" w:cstheme="majorBidi" w:ascii="Aptos" w:hAnsi="Aptos"/>
       <w:b/>
       <w:color w:val="000000"/>
       <w:spacing w:val="5"/>
       <w:kern w:val="28"/>
-      <w:sz w:val="42"/>
+      <w:sz w:val="36"/>
       <w:szCs w:val="52"/>
     </w:rPr>
   </w:style>
@@ -1314,14 +1298,16 @@
       <w:numPr>
         <w:ilvl w:val="1"/>
       </w:numPr>
+      <w:spacing w:before="180" w:after="100"/>
     </w:pPr>
     <w:rPr>
-      <w:rFonts w:asciiTheme="majorHAnsi" w:eastAsiaTheme="majorEastAsia" w:hAnsiTheme="majorHAnsi" w:cstheme="majorBidi"/>
+      <w:rFonts w:asciiTheme="majorHAnsi" w:eastAsiaTheme="majorEastAsia" w:hAnsiTheme="majorHAnsi" w:cstheme="majorBidi" w:ascii="Aptos" w:hAnsi="Aptos"/>
+      <w:b w:val="0"/>
       <w:i/>
       <w:iCs/>
-      <w:color w:val="28465A"/>
+      <w:color w:val="000000"/>
       <w:spacing w:val="15"/>
-      <w:sz w:val="24"/>
+      <w:sz w:val="21"/>
       <w:szCs w:val="24"/>
     </w:rPr>
   </w:style>

</xml_diff>